<commit_message>
doc: replace personal name with CNPJ details in proposal and regenerate docx
</commit_message>
<xml_diff>
--- a/proposta_comercial_fiema.docx
+++ b/proposta_comercial_fiema.docx
@@ -41,7 +41,7 @@
         <w:t>Proponente:</w:t>
       </w:r>
       <w:r>
-        <w:t xml:space="preserve"> ACDEV Consultoria (André Felipe Carvalho Pinheiro)</w:t>
+        <w:t xml:space="preserve"> ACDEV Consultoria (CNPJ: 42.180.462/0001-88)</w:t>
       </w:r>
     </w:p>
     <w:p>
@@ -1998,7 +1998,7 @@
         <w:spacing w:before="80" w:after="120" w:line="276" w:lineRule="auto"/>
       </w:pPr>
       <w:r>
-        <w:t>André Felipe Carvalho Pinheiro</w:t>
+        <w:t>CNPJ: 42.180.462/0001-88</w:t>
       </w:r>
     </w:p>
     <w:sectPr>

</xml_diff>

<commit_message>
doc: update proposal cover page, detailed support terms, and client homologation requirements
</commit_message>
<xml_diff>
--- a/proposta_comercial_fiema.docx
+++ b/proposta_comercial_fiema.docx
@@ -11,7 +11,7 @@
           <w:b/>
           <w:sz w:val="40"/>
         </w:rPr>
-        <w:t>Proposta Comercial — Novo Portal Institucional FIEMA</w:t>
+        <w:t>Proposta Comercial — Projeto de Modernização do Portal FIEMA</w:t>
       </w:r>
     </w:p>
     <w:p>
@@ -438,6 +438,31 @@
     </w:p>
     <w:p>
       <w:pPr>
+        <w:pStyle w:val="ListBullet"/>
+        <w:spacing w:before="40" w:after="40"/>
+      </w:pPr>
+      <w:r/>
+      <w:r>
+        <w:rPr>
+          <w:b/>
+        </w:rPr>
+        <w:t>Profissional de Homologação</w:t>
+      </w:r>
+      <w:r>
+        <w:t xml:space="preserve">: A FIEMA deverá designar e formalizar um profissional (ou equipe dedicada) responsável como ponto de contato para avaliar, validar e realizar a </w:t>
+      </w:r>
+      <w:r>
+        <w:rPr>
+          <w:b/>
+        </w:rPr>
+        <w:t>homologação formal das entregas ao final de cada Sprint</w:t>
+      </w:r>
+      <w:r>
+        <w:t>, garantindo o cumprimento do cronograma.</w:t>
+      </w:r>
+    </w:p>
+    <w:p>
+      <w:pPr>
         <w:spacing w:before="120" w:after="120"/>
       </w:pPr>
       <w:r>
@@ -744,7 +769,7 @@
         <w:t>PaaS (Coolify) &amp; Docker</w:t>
       </w:r>
       <w:r>
-        <w:t>: Plataforma de gerenciamento de containers instalada no servidor da FIEMA que orquestra Next.js, Strapi, Java, Listmonk e bancos de dados em containers Docker isolados e seguros.</w:t>
+        <w:t>: Plataforma de gerenciamento de containers instalada no servidor da FIEMA que orquestra Next.js, Strapi, Java, Listmonk e bancos de dados in-box em containers Docker isolados e seguros.</w:t>
       </w:r>
     </w:p>
     <w:p>
@@ -1245,7 +1270,7 @@
             </w:pPr>
             <w:r/>
             <w:r>
-              <w:t>Desenvolvimento do microsserviço Java (Spring Boot) para extração de dados e mapeamento das tabelas do site legado.</w:t>
+              <w:t>Desenvolvimento da aplicação Java (Spring Boot) para extração de dados e mapeamento das tabelas do site legado.</w:t>
             </w:r>
           </w:p>
         </w:tc>
@@ -1829,7 +1854,7 @@
         <w:spacing w:before="80" w:after="120" w:line="276" w:lineRule="auto"/>
       </w:pPr>
       <w:r>
-        <w:t>Após o encerramento do desenvolvimento e a publicação definitiva do portal, inicia-se o período de manutenção:</w:t>
+        <w:t>Após o encerramento do desenvolvimento e a publicação definitiva do portal, inicia-se o contrato de suporte e sustentação técnica:</w:t>
       </w:r>
     </w:p>
     <w:p>
@@ -1867,17 +1892,165 @@
         <w:rPr>
           <w:b/>
         </w:rPr>
-        <w:t>Escopo do Suporte Mensal:</w:t>
+        <w:t>Vigência e Renovação</w:t>
       </w:r>
-      <w:r/>
+      <w:r>
+        <w:t xml:space="preserve">: O contrato de suporte tem prazo de </w:t>
+      </w:r>
+      <w:r>
+        <w:rPr>
+          <w:b/>
+        </w:rPr>
+        <w:t>1 (um) ano</w:t>
+      </w:r>
+      <w:r>
+        <w:t>, com renovação automática por períodos iguais e sucessivos de 12 meses.</w:t>
+      </w:r>
     </w:p>
     <w:p>
       <w:pPr>
         <w:pStyle w:val="ListBullet"/>
         <w:spacing w:before="40" w:after="40"/>
       </w:pPr>
+      <w:r/>
       <w:r>
-        <w:t>Monitoramento preventivo de saúde da aplicação no Grafana.</w:t>
+        <w:rPr>
+          <w:b/>
+        </w:rPr>
+        <w:t>Índice de Reajuste Anual</w:t>
+      </w:r>
+      <w:r>
+        <w:t xml:space="preserve">: O valor mensal do suporte será reajustado anualmente no mês de aniversário da assinatura com base na variação acumulada do </w:t>
+      </w:r>
+      <w:r>
+        <w:rPr>
+          <w:b/>
+        </w:rPr>
+        <w:t>IPCA/IBGE</w:t>
+      </w:r>
+      <w:r>
+        <w:t xml:space="preserve"> (Índice Nacional de Preços ao Consumidor Amplo) acumulado do período.</w:t>
+      </w:r>
+    </w:p>
+    <w:p>
+      <w:pPr>
+        <w:pStyle w:val="ListBullet"/>
+        <w:spacing w:before="40" w:after="40"/>
+      </w:pPr>
+      <w:r/>
+      <w:r>
+        <w:rPr>
+          <w:b/>
+        </w:rPr>
+        <w:t>Escopo do Suporte Mensal (Incluso)</w:t>
+      </w:r>
+      <w:r>
+        <w:t>:</w:t>
+      </w:r>
+    </w:p>
+    <w:p>
+      <w:pPr>
+        <w:pStyle w:val="ListBullet"/>
+        <w:spacing w:before="40" w:after="40"/>
+      </w:pPr>
+      <w:r/>
+      <w:r>
+        <w:rPr>
+          <w:b/>
+        </w:rPr>
+        <w:t>Correção de Bugs</w:t>
+      </w:r>
+      <w:r>
+        <w:t>: Resolução de erros ou comportamentos inesperados de software que não tenham sido detectados durante a fase de desenvolvimento e homologação.</w:t>
+      </w:r>
+    </w:p>
+    <w:p>
+      <w:pPr>
+        <w:pStyle w:val="ListBullet"/>
+        <w:spacing w:before="40" w:after="40"/>
+      </w:pPr>
+      <w:r/>
+      <w:r>
+        <w:rPr>
+          <w:b/>
+        </w:rPr>
+        <w:t>Resolução de Dúvidas</w:t>
+      </w:r>
+      <w:r>
+        <w:t>: Apoio operacional e esclarecimento de dúvidas da equipe da FIEMA referentes ao uso cotidiano do Strapi CMS e da ferramenta Listmonk.</w:t>
+      </w:r>
+    </w:p>
+    <w:p>
+      <w:pPr>
+        <w:pStyle w:val="ListBullet"/>
+        <w:spacing w:before="40" w:after="40"/>
+      </w:pPr>
+      <w:r/>
+      <w:r>
+        <w:rPr>
+          <w:b/>
+        </w:rPr>
+        <w:t>Monitoramento e Estabilidade</w:t>
+      </w:r>
+      <w:r>
+        <w:t>: Acompanhamento preventivo da saúde do portal nos dashboards do Grafana e restabelecimento das aplicações em caso de quedas ou travamentos.</w:t>
+      </w:r>
+    </w:p>
+    <w:p>
+      <w:pPr>
+        <w:pStyle w:val="ListBullet"/>
+        <w:spacing w:before="40" w:after="40"/>
+      </w:pPr>
+      <w:r/>
+      <w:r>
+        <w:rPr>
+          <w:b/>
+        </w:rPr>
+        <w:t>Patches e Atualizações</w:t>
+      </w:r>
+      <w:r>
+        <w:t>: Aplicação de atualizações de segurança críticas e patches de dependências nas plataformas.</w:t>
+      </w:r>
+    </w:p>
+    <w:p>
+      <w:pPr>
+        <w:pStyle w:val="ListBullet"/>
+        <w:spacing w:before="40" w:after="40"/>
+      </w:pPr>
+      <w:r/>
+      <w:r>
+        <w:rPr>
+          <w:b/>
+        </w:rPr>
+        <w:t>Limite Mensal de Esforço</w:t>
+      </w:r>
+      <w:r>
+        <w:t xml:space="preserve">: O suporte compreende um limite de até </w:t>
+      </w:r>
+      <w:r>
+        <w:rPr>
+          <w:b/>
+        </w:rPr>
+        <w:t>8 (oito) horas mensais</w:t>
+      </w:r>
+      <w:r>
+        <w:t xml:space="preserve"> de atendimento técnico.</w:t>
+      </w:r>
+    </w:p>
+    <w:p>
+      <w:pPr>
+        <w:pStyle w:val="ListBullet"/>
+        <w:spacing w:before="40" w:after="40"/>
+      </w:pPr>
+      <w:r/>
+      <w:r>
+        <w:rPr>
+          <w:b/>
+        </w:rPr>
+        <w:t>Novas Funcionalidades (Excluído do Suporte)</w:t>
+      </w:r>
+      <w:r>
+        <w:t>:</w:t>
       </w:r>
     </w:p>
     <w:p>
@@ -1886,7 +2059,7 @@
         <w:spacing w:before="40" w:after="40"/>
       </w:pPr>
       <w:r>
-        <w:t>Verificação de rotinas de backup do banco de dados (Strapi, Listmonk e logs de integração).</w:t>
+        <w:t>O desenvolvimento de novas páginas, alterações profundas de layout pós-homologação ou novas funcionalidades não fazem parte do escopo de manutenção preventiva.</w:t>
       </w:r>
     </w:p>
     <w:p>
@@ -1895,7 +2068,16 @@
         <w:spacing w:before="40" w:after="40"/>
       </w:pPr>
       <w:r>
-        <w:t>Aplicação de patches de segurança críticos e atualizações de dependências das ferramentas (Next.js, Strapi, Spring Boot e Coolify).</w:t>
+        <w:t xml:space="preserve">Demandas de novas implementações serão tratadas de forma avulsa, cobradas à taxa horária de </w:t>
+      </w:r>
+      <w:r>
+        <w:rPr>
+          <w:b/>
+        </w:rPr>
+        <w:t>R$ 250,00 / hora</w:t>
+      </w:r>
+      <w:r>
+        <w:t>, sob orçamento prévio aprovado.</w:t>
       </w:r>
     </w:p>
     <w:p>
@@ -1903,8 +2085,33 @@
         <w:pStyle w:val="ListBullet"/>
         <w:spacing w:before="40" w:after="40"/>
       </w:pPr>
+      <w:r/>
       <w:r>
-        <w:t>Restabelecimento do serviço em caso de travamentos de software locais.</w:t>
+        <w:rPr>
+          <w:b/>
+        </w:rPr>
+        <w:t>Canal de Atendimento e SLA</w:t>
+      </w:r>
+      <w:r>
+        <w:t xml:space="preserve">: Os chamados deverão ser abertos via e-mail oficial da consultoria, com tempo de resposta (SLA) de até </w:t>
+      </w:r>
+      <w:r>
+        <w:rPr>
+          <w:b/>
+        </w:rPr>
+        <w:t>24 horas úteis</w:t>
+      </w:r>
+      <w:r>
+        <w:t xml:space="preserve"> para solicitações comuns e até </w:t>
+      </w:r>
+      <w:r>
+        <w:rPr>
+          <w:b/>
+        </w:rPr>
+        <w:t>4 horas úteis</w:t>
+      </w:r>
+      <w:r>
+        <w:t xml:space="preserve"> para incidentes críticos (site fora do ar).</w:t>
       </w:r>
     </w:p>
     <w:p>

</xml_diff>